<commit_message>
feat: campo "Anotações do Caso" no documento de cadastro (Word)
O texto do campo "Anotações do Caso" (bloco Anotações gerais) passa a
aparecer no documento de cadastro, numa tabela separada abaixo da tabela
de dados, na mesma página. A tabela só aparece quando há texto e tem 3
linhas em branco para folga visual.

- gerar-documento/route.ts: lê analise_juridica.anotacoes.anotacoes_livres
  e injeta como {anotacoes}/{tem_anotacoes} no render.
- template-carmes.docx: tabela "ANOTAÇÕES DO CASO" (via script), separada
  da tabela de cadastro por um parágrafo espaçador.
- scripts/add-tabela-anotacoes.mjs: registra/reexecuta a edição no template.

Co-Authored-By: Claude Opus 4.8 <noreply@anthropic.com>
</commit_message>
<xml_diff>
--- a/public/template-documentos/template-carmes.docx
+++ b/public/template-documentos/template-carmes.docx
@@ -2855,6 +2855,131 @@
         </w:tc>
       </w:tr>
     </w:tbl>
+    <w:p>
+      <w:r>
+        <w:t>{#tem_anotacoes}</w:t>
+      </w:r>
+    </w:p>
+    <w:p>
+      <w:pPr>
+        <w:spacing w:after="0" w:line="240" w:lineRule="auto"/>
+        <w:rPr>
+          <w:rFonts w:ascii="Arial Narrow" w:hAnsi="Arial Narrow" w:cs="Arial Narrow"/>
+          <w:sz w:val="24"/>
+          <w:szCs w:val="24"/>
+        </w:rPr>
+      </w:pPr>
+    </w:p>
+    <w:tbl>
+      <w:tblPr>
+        <w:tblW w:w="10636" w:type="dxa"/>
+        <w:tblInd w:w="93" w:type="dxa"/>
+        <w:tblBorders>
+          <w:top w:val="single" w:sz="4" w:space="0" w:color="auto"/>
+          <w:left w:val="single" w:sz="4" w:space="0" w:color="auto"/>
+          <w:bottom w:val="single" w:sz="4" w:space="0" w:color="auto"/>
+          <w:right w:val="single" w:sz="4" w:space="0" w:color="auto"/>
+          <w:insideH w:val="single" w:sz="4" w:space="0" w:color="auto"/>
+          <w:insideV w:val="single" w:sz="4" w:space="0" w:color="auto"/>
+        </w:tblBorders>
+        <w:tblLook w:val="04A0" w:firstRow="1" w:lastRow="0" w:firstColumn="1" w:lastColumn="0" w:noHBand="0" w:noVBand="1"/>
+      </w:tblPr>
+      <w:tblGrid>
+        <w:gridCol w:w="10636"/>
+      </w:tblGrid>
+      <w:tr>
+        <w:tc>
+          <w:tcPr>
+            <w:tcW w:w="10636" w:type="dxa"/>
+            <w:vAlign w:val="center"/>
+          </w:tcPr>
+          <w:p>
+            <w:pPr>
+              <w:spacing w:after="0" w:line="240" w:lineRule="auto"/>
+              <w:jc w:val="center"/>
+              <w:rPr>
+                <w:rFonts w:ascii="Arial Narrow" w:hAnsi="Arial Narrow" w:cs="Arial Narrow"/>
+                <w:b/>
+                <w:bCs/>
+                <w:sz w:val="28"/>
+                <w:szCs w:val="28"/>
+              </w:rPr>
+            </w:pPr>
+            <w:r>
+              <w:rPr>
+                <w:rFonts w:ascii="Arial Narrow" w:hAnsi="Arial Narrow" w:cs="Arial Narrow"/>
+                <w:b/>
+                <w:bCs/>
+                <w:sz w:val="28"/>
+                <w:szCs w:val="28"/>
+              </w:rPr>
+              <w:t>ANOTAÇÕES DO CASO</w:t>
+            </w:r>
+          </w:p>
+        </w:tc>
+      </w:tr>
+      <w:tr>
+        <w:tc>
+          <w:tcPr>
+            <w:tcW w:w="10636" w:type="dxa"/>
+          </w:tcPr>
+          <w:p>
+            <w:pPr>
+              <w:spacing w:after="0" w:line="240" w:lineRule="auto"/>
+              <w:jc w:val="both"/>
+              <w:rPr>
+                <w:rFonts w:ascii="Arial Narrow" w:hAnsi="Arial Narrow" w:cs="Arial Narrow"/>
+                <w:sz w:val="24"/>
+                <w:szCs w:val="24"/>
+              </w:rPr>
+            </w:pPr>
+            <w:r>
+              <w:rPr>
+                <w:rFonts w:ascii="Arial Narrow" w:hAnsi="Arial Narrow" w:cs="Arial Narrow"/>
+                <w:sz w:val="24"/>
+                <w:szCs w:val="24"/>
+              </w:rPr>
+              <w:t xml:space="preserve">{anotacoes}</w:t>
+            </w:r>
+          </w:p>
+          <w:p>
+            <w:pPr>
+              <w:spacing w:after="0" w:line="240" w:lineRule="auto"/>
+              <w:rPr>
+                <w:rFonts w:ascii="Arial Narrow" w:hAnsi="Arial Narrow" w:cs="Arial Narrow"/>
+                <w:sz w:val="24"/>
+                <w:szCs w:val="24"/>
+              </w:rPr>
+            </w:pPr>
+          </w:p>
+          <w:p>
+            <w:pPr>
+              <w:spacing w:after="0" w:line="240" w:lineRule="auto"/>
+              <w:rPr>
+                <w:rFonts w:ascii="Arial Narrow" w:hAnsi="Arial Narrow" w:cs="Arial Narrow"/>
+                <w:sz w:val="24"/>
+                <w:szCs w:val="24"/>
+              </w:rPr>
+            </w:pPr>
+          </w:p>
+          <w:p>
+            <w:pPr>
+              <w:spacing w:after="0" w:line="240" w:lineRule="auto"/>
+              <w:rPr>
+                <w:rFonts w:ascii="Arial Narrow" w:hAnsi="Arial Narrow" w:cs="Arial Narrow"/>
+                <w:sz w:val="24"/>
+                <w:szCs w:val="24"/>
+              </w:rPr>
+            </w:pPr>
+          </w:p>
+        </w:tc>
+      </w:tr>
+    </w:tbl>
+    <w:p>
+      <w:r>
+        <w:t>{/tem_anotacoes}</w:t>
+      </w:r>
+    </w:p>
     <w:p>
       <w:r>
         <w:rPr>

</xml_diff>